<commit_message>
Densify Bioinformatics abstract within the 200-word cap
Add the previously cut findings (scArches no-op, +4.1 pp unfreezing without
identity rescue, wider-window lineage rescue 0.87-0.96) and the closing
takeaway (same-distribution claims unmeasured; released harness testable).
199 words including labels.
</commit_message>
<xml_diff>
--- a/submission/bioinformatics/manuscript_bioinformatics.docx
+++ b/submission/bioinformatics/manuscript_bioinformatics.docx
@@ -99,7 +99,7 @@
         <w:t xml:space="preserve"> </w:t>
       </w:r>
       <w:r>
-        <w:t xml:space="preserve">Virtual-cell foundation models promise general cell-state representation, yet standard evaluations largely re-measure states the model has already seen. Embryonic development is a stricter test: along a single time axis, cells both progress and enter genuinely novel states.</w:t>
+        <w:t xml:space="preserve">Virtual-cell foundation models promise general cell-state representation, yet evaluations largely re-measure states the models have already seen; embryonic development is stricter, adding genuinely novel states along one time axis.</w:t>
       </w:r>
     </w:p>
     <w:p>
@@ -117,7 +117,7 @@
         <w:t xml:space="preserve"> </w:t>
       </w:r>
       <w:r>
-        <w:t xml:space="preserve">We benchmark seven methods spanning three generations (PCA-50, Harmony, scVI, STATE SE-600M, UCE, Geneformer V1-10M and TranscriptFormer) on two public embryonic atlases under one time-split protocol: identical kNN reference mapping, majority baselines and bootstraps over fish or embryos. Coarse lineage identity transfers in every method (0.50–0.86 zebrafish, 0.64–0.69 mouse, versus 0.352 and 0.266 baselines), led on zebrafish by natively pretrained TranscriptFormer (0.864; gene-set control 0.869), an advantage that vanishes on mouse and under a linear probe. Fine-grained identity fails in every method and species (0.040–0.073 versus 0.100 and 0.117) despite 0.63–0.98 in-distribution retrieval, and novel states are silently absorbed (AUROC 0.60–0.66). A random 80/20 split inflates cluster accuracy 9–21-fold, quantifying what conventional same-distribution evaluation overstates.</w:t>
+        <w:t xml:space="preserve">We benchmark seven methods across three generations (PCA-50, Harmony, scVI, STATE SE-600M, UCE, Geneformer V1-10M and TranscriptFormer) on two embryonic atlases under one time-split kNN protocol with majority baselines and fish- or embryo-level bootstraps. Coarse lineage identity transfers in every method (0.50–0.86 zebrafish, 0.64–0.69 mouse, versus 0.352 and 0.266 baselines), led on zebrafish by natively pretrained TranscriptFormer (0.864; gene-set control 0.869), an advantage absent on mouse and under linear probes. Fine-grained identity fails everywhere (0.040–0.073 versus 0.100/0.117) despite 0.63–0.98 in-distribution retrieval; novel states are silently absorbed (AUROC 0.60–0.66); default scArches surgery is a no-op, and full unfreezing adds 4.1 points without rescuing identity; wider training windows rescue lineage (0.87–0.96) but never identity. Random 80/20 splits inflate cluster accuracy 9–21-fold: same-distribution state-prediction claims are unmeasured, and the released time-split harness makes them testable.</w:t>
       </w:r>
     </w:p>
     <w:p>
@@ -135,7 +135,7 @@
         <w:t xml:space="preserve"> </w:t>
       </w:r>
       <w:r>
-        <w:t xml:space="preserve">Implemented in Python (PyTorch). Code, splits, embeddings, results and provenance are freely available at https://github.com/[account]/[repository]; a public DOI will be added at submission.</w:t>
+        <w:t xml:space="preserve">Implemented in Python (PyTorch); code, splits, embeddings, results and provenance are freely available at https://github.com/[account]/[repository] (DOI to follow at submission).</w:t>
       </w:r>
     </w:p>
     <w:p>

</xml_diff>

<commit_message>
Sync manuscript and figures with the verified reference upgrade and figure improvements
- References: TranscriptFormer now cited as Pearce et al., Science 393:aec8514
  (PMID 42096520); all 30 records cross-verified against Europe PMC and
  Crossref/DataCite (title/year/volume/pages/DOI all consistent)
- Bioinformatics-format abstract: dataset names and sizes added within the
  200-word cap; repository URL filled in Availability
- Figures 2/3/4/S2 regenerated with unified majority baselines, per-panel
  drift indices, direct line labels, desaturated confusion diagonals
- Added submission/references.ris and references.csl.json (30 verified
  records) and the Word table volume (Tables 1-2 + S1-S9)
</commit_message>
<xml_diff>
--- a/submission/bioinformatics/manuscript_bioinformatics.docx
+++ b/submission/bioinformatics/manuscript_bioinformatics.docx
@@ -99,7 +99,7 @@
         <w:t xml:space="preserve"> </w:t>
       </w:r>
       <w:r>
-        <w:t xml:space="preserve">Virtual-cell foundation models promise general cell-state representation, yet evaluations largely re-measure states the models have already seen; embryonic development is stricter, adding genuinely novel states along one time axis.</w:t>
+        <w:t xml:space="preserve">Virtual-cell foundation models promise general cell-state representation, yet evaluations largely re-measure seen states; embryonic development is stricter, adding novel states along one time axis.</w:t>
       </w:r>
     </w:p>
     <w:p>
@@ -117,7 +117,7 @@
         <w:t xml:space="preserve"> </w:t>
       </w:r>
       <w:r>
-        <w:t xml:space="preserve">We benchmark seven methods across three generations (PCA-50, Harmony, scVI, STATE SE-600M, UCE, Geneformer V1-10M and TranscriptFormer) on two embryonic atlases under one time-split kNN protocol with majority baselines and fish- or embryo-level bootstraps. Coarse lineage identity transfers in every method (0.50–0.86 zebrafish, 0.64–0.69 mouse, versus 0.352 and 0.266 baselines), led on zebrafish by natively pretrained TranscriptFormer (0.864; gene-set control 0.869), an advantage absent on mouse and under linear probes. Fine-grained identity fails everywhere (0.040–0.073 versus 0.100/0.117) despite 0.63–0.98 in-distribution retrieval; novel states are silently absorbed (AUROC 0.60–0.66); default scArches surgery is a no-op, and full unfreezing adds 4.1 points without rescuing identity; wider training windows rescue lineage (0.87–0.96) but never identity. Random 80/20 splits inflate cluster accuracy 9–21-fold: same-distribution state-prediction claims are unmeasured, and the released time-split harness makes them testable.</w:t>
+        <w:t xml:space="preserve">We benchmark seven methods across three generations (PCA-50, Harmony, scVI, STATE SE-600M, UCE, Geneformer V1-10M and TranscriptFormer) on two embryonic atlases, Zebrahub zebrafish (120,444 cells) and mouse gastrulation E-MTAB-6967 (108,857 cells), each time-split into early-train and late-test; one kNN protocol, majority baselines, replicate bootstraps. Coarse lineage identity transfers in every method (0.50–0.86 zebrafish, 0.64–0.69 mouse, versus 0.352 and 0.266 baselines), led on zebrafish by natively pretrained TranscriptFormer (0.864; gene-set control 0.869), an advantage absent on mouse and under linear probes. Fine-grained identity fails everywhere (0.040–0.073 versus 0.100/0.117) despite 0.63–0.98 in-distribution retrieval; novel states enter correct lineages yet go unflagged (AUROC 0.60–0.66); default scArches surgery is a no-op and full unfreezing adds 4.1 points without rescuing identity; wider training windows rescue lineage (0.87–0.96) but never identity. Random 80/20 splits inflate cluster accuracy 9–21-fold; same-distribution state-prediction claims are unmeasured, and our released harness makes them testable.</w:t>
       </w:r>
     </w:p>
     <w:p>
@@ -135,7 +135,7 @@
         <w:t xml:space="preserve"> </w:t>
       </w:r>
       <w:r>
-        <w:t xml:space="preserve">Implemented in Python (PyTorch); code, splits, embeddings, results and provenance are freely available at https://github.com/[account]/[repository] (DOI to follow at submission).</w:t>
+        <w:t xml:space="preserve">Python/PyTorch; code, splits, embeddings, results and provenance at https://github.com/Kuxima/virtual-cell-temporal-benchmark (DOI pending).</w:t>
       </w:r>
     </w:p>
     <w:p>
@@ -198,7 +198,7 @@
         <w:t xml:space="preserve">“virtual cell”</w:t>
       </w:r>
       <w:r>
-        <w:t xml:space="preserve">: a learnable model that represents cell state generally enough to predict how cells respond to perturbation, differentiation signals, or developmental time (Bunne et al., 2024). Single-cell transcriptomics has turned this ambition into an engineering programme, now increasingly assisted by agentic systems that automate the surrounding analysis (Huang et al., 2025). A first generation of foundation models, Geneformer (Theodoris et al., 2023), scGPT (Cui et al., 2024) and the cross-species GeneCompass (Yang et al., 2024), showed that transformers pretrained on tens of millions of profiles learn transferable gene-level representations. A second generation has made the cell-state ambition explicit: Universal Cell Embeddings place 36 million cells from eight species into one biological latent space (Rosen et al., 2026), STATE (SE-600M) predicts a protein-anchored cell-state vector directly from a transcriptome (Arc Institute, 2025), and TranscriptFormer learns across twelve metazoan species and 112 million cells (TranscriptFormer, 2026). These models are increasingly presented as general-purpose instruments for interpreting cells they have never seen.</w:t>
+        <w:t xml:space="preserve">: a learnable model that represents cell state generally enough to predict how cells respond to perturbation, differentiation signals, or developmental time (Bunne et al., 2024). Single-cell transcriptomics has turned this ambition into an engineering programme, now increasingly assisted by agentic systems that automate the surrounding analysis (Huang et al., 2025). A first generation of foundation models, Geneformer (Theodoris et al., 2023), scGPT (Cui et al., 2024) and the cross-species GeneCompass (Yang et al., 2024), showed that transformers pretrained on tens of millions of profiles learn transferable gene-level representations. A second generation has made the cell-state ambition explicit: Universal Cell Embeddings place 36 million cells from eight species into one biological latent space (Rosen et al., 2026), STATE (SE-600M) predicts a protein-anchored cell-state vector directly from a transcriptome (Arc Institute, 2025), and TranscriptFormer learns across twelve metazoan species and 112 million cells (Pearce et al., 2026). These models are increasingly presented as general-purpose instruments for interpreting cells they have never seen.</w:t>
       </w:r>
     </w:p>
     <w:p>
@@ -1690,6 +1690,14 @@
         <w:pStyle w:val="BodyText"/>
       </w:pPr>
       <w:r>
+        <w:t xml:space="preserve">Pearce JD, Simmonds SE, Mahmoudabadi G et al. TranscriptFormer: a generative cell atlas across 1.5 billion years of evolution. Science 2026;393:aec8514.</w:t>
+      </w:r>
+    </w:p>
+    <w:p>
+      <w:pPr>
+        <w:pStyle w:val="BodyText"/>
+      </w:pPr>
+      <w:r>
         <w:t xml:space="preserve">Qiu P, Chen Q, Qin H et al. BioLLM: a standardized framework for integrating and benchmarking single-cell foundation models. Patterns 2025;6:101326.</w:t>
       </w:r>
     </w:p>
@@ -1731,14 +1739,6 @@
       </w:pPr>
       <w:r>
         <w:t xml:space="preserve">Theunissen L, Mortier T, Saeys Y et al. Evaluation of out-of-distribution detection methods for data shifts in single-cell transcriptomics. Brief Bioinform 2025;26:bbaf239.</w:t>
-      </w:r>
-    </w:p>
-    <w:p>
-      <w:pPr>
-        <w:pStyle w:val="BodyText"/>
-      </w:pPr>
-      <w:r>
-        <w:t xml:space="preserve">TranscriptFormer cross-species foundation model (2026) bioRxiv 2025.04.25.650731; published as Science, DOI 10.1126/science.aec8514 [full author list and pages to be completed at submission].</w:t>
       </w:r>
     </w:p>
     <w:p>
@@ -1916,7 +1916,7 @@
         <w:t xml:space="preserve">scanpy.pp.neighbors</w:t>
       </w:r>
       <w:r>
-        <w:t xml:space="preserve">, k = 15, seed 42); top row, classical methods (PCA-50, Harmony, scVI); bottom row, foundation models (STATE SE-600M, UCE, Geneformer V1, TranscriptFormer). Cells are coloured by developmental-stage group: grey, training window (10–16 hpf); amber, 19–24 hpf; red, 2–3 dpf; blue, 5–10 dpf. The black arrow joins the training-window centroid to the late-test (5–10 dpf) centroid in each map, visualizing how far future embryos drift off the reference manifold; direction is embedding-specific (in STATE, for example, the late centroid falls on the opposite side of the map). Late stages occupy map regions outside the training window in every panel, but their distance to it varies by model; compare PCA-50 (A) with TranscriptFormer (G). The centroid displacement is significant for every model in the original embedding space (one-sided permutation, B = 1,000, p = 0.001), with drift indices from 1.7 (Harmony) to 16.8 (TranscriptFormer) (Section 3.3).</w:t>
+        <w:t xml:space="preserve">, k = 15, seed 42); top row, classical methods (PCA-50, Harmony, scVI); bottom row, foundation models (STATE SE-600M, UCE, Geneformer V1, TranscriptFormer). Cells are coloured by developmental-stage group: grey, training window (10–16 hpf); amber, 19–24 hpf; red, 2–3 dpf; blue, 5–10 dpf. The black arrow joins the training-window centroid to the late-test (5–10 dpf) centroid in each map, visualizing how far future embryos drift off the reference manifold; direction is embedding-specific (in STATE, for example, the late centroid falls on the opposite side of the map). Late stages occupy map regions outside the training window in every panel, but their distance to it varies by model; compare PCA-50 (A) with TranscriptFormer (G). The centroid displacement is significant for every model in the original embedding space (one-sided permutation, B = 1,000, p = 0.001), with drift indices from 1.7 (Harmony) to 16.8 (TranscriptFormer), quoted in each panel (Section 3.3).</w:t>
       </w:r>
     </w:p>
     <w:p>
@@ -1982,7 +1982,7 @@
         <w:t xml:space="preserve"> </w:t>
       </w:r>
       <w:r>
-        <w:t xml:space="preserve">(A, B) Zebrafish lineage accuracy (A) and shared-cluster accuracy (B) as the training right endpoint moves from 16 to 19, 24 and 72 hpf (horizontal axis; test = all later stages). Frozen-model embeddings are re-probed unchanged; PCA, Harmony and scVI are retrained per window (scVI frozen protocol, seed 42); the grey dashed line is the per-window majority baseline (labelled</w:t>
+        <w:t xml:space="preserve">(A, B) Zebrafish lineage accuracy (A) and shared-cluster accuracy (B) as the training right endpoint moves from 16 to 19, 24 and 72 hpf (horizontal axis; test = all later stages). Frozen-model embeddings are re-probed unchanged; PCA, Harmony and scVI are retrained per window (scVI frozen protocol, seed 42); the black dashed line is the per-window majority baseline (labelled</w:t>
       </w:r>
       <w:r>
         <w:t xml:space="preserve"> </w:t>
@@ -2003,7 +2003,7 @@
         <w:t xml:space="preserve"> </w:t>
       </w:r>
       <w:r>
-        <w:t xml:space="preserve">marks models natively pretrained on the benchmark species. The four strongest foundation models are unchanged (Δ ≤ +0.013) while PCA (−0.47), Harmony (−0.51) and Geneformer (−0.16) degrade. (D, E) Random-split ceiling: paired horizontal bars per model give accuracy under the temporal split (solid; train ≤ 16 hpf) and a random 80/20 cell split (hatched) on the same cells and protocol, for lineage (D) and shared-cluster accuracy (E); PCA, Harmony and scVI are retrained on the random split, and native-species models are set in bold. The gap, 9–21× on the cluster task, quantifies the optimism of same-distribution evaluation (Section 3.9, Supplementary Table S9).</w:t>
+        <w:t xml:space="preserve">marks models natively pretrained on the benchmark species. The four strongest foundation models are unchanged (Δ ≤ +0.013) while PCA (−0.47), Harmony (−0.51) and Geneformer (−0.16) degrade. (D, E) Random-split ceiling: paired horizontal bars per model give accuracy under the temporal split (solid; train ≤ 16 hpf) and a random 80/20 cell split (hatched) on the same cells and protocol, for lineage (D) and shared-cluster accuracy (E); PCA, Harmony and scVI are retrained on the random split, and native-species models are set in bold. The black dashed line in D and E marks the time-split majority baseline (0.352 lineage, 0.100 cluster); random-split majority values are given in Supplementary Table S9. The gap, 9–21× on the cluster task, quantifies the optimism of same-distribution evaluation (Section 3.9, Supplementary Table S9).</w:t>
       </w:r>
     </w:p>
     <w:bookmarkEnd w:id="34"/>

</xml_diff>